<commit_message>
saving progress collating Z
</commit_message>
<xml_diff>
--- a/C82Brecon.docx
+++ b/C82Brecon.docx
@@ -1464,7 +1464,19 @@
         <w:rPr>
           <w:lang w:val="fr-FR"/>
         </w:rPr>
-        <w:t>ea omnia et singula ad manus nostas Racione et pretextu dissoluc’ dicti nuper priorat’ sive domus [eol]</w:t>
+        <w:t>ea omnia et singula ad manus nost</w:t>
+      </w:r>
+      <w:r>
+        <w:rPr>
+          <w:lang w:val="fr-FR"/>
+        </w:rPr>
+        <w:t>r</w:t>
+      </w:r>
+      <w:r>
+        <w:rPr>
+          <w:lang w:val="fr-FR"/>
+        </w:rPr>
+        <w:t>as Racione et pretextu dissoluc’ dicti nuper priorat’ sive domus [eol]</w:t>
       </w:r>
     </w:p>
     <w:p>
@@ -1528,7 +1540,19 @@
         <w:rPr>
           <w:lang w:val="fr-FR"/>
         </w:rPr>
-        <w:t>existere debent vel deberent Habend’ tenend et gaudend’ predict’ dom</w:t>
+        <w:t xml:space="preserve">existere debent vel deberent </w:t>
+      </w:r>
+      <w:r>
+        <w:rPr>
+          <w:lang w:val="fr-FR"/>
+        </w:rPr>
+        <w:t xml:space="preserve">[ab 9 begins here] </w:t>
+      </w:r>
+      <w:r>
+        <w:rPr>
+          <w:lang w:val="fr-FR"/>
+        </w:rPr>
+        <w:t>Habend’ tenend et gaudend’ predict’ dom</w:t>
       </w:r>
       <w:r>
         <w:rPr>

</xml_diff>

<commit_message>
up to line 36 of Z
</commit_message>
<xml_diff>
--- a/C82Brecon.docx
+++ b/C82Brecon.docx
@@ -1868,7 +1868,19 @@
         <w:rPr>
           <w:lang w:val="fr-FR"/>
         </w:rPr>
-        <w:t>et servicia ac omnia et singula premissa cum pertine’ eidem Episcopo et success’ suis ex dono nostro absque [eol]</w:t>
+        <w:t xml:space="preserve">et servicia ac omnia et singula premissa cum pertine’ eidem </w:t>
+      </w:r>
+      <w:r>
+        <w:rPr>
+          <w:lang w:val="fr-FR"/>
+        </w:rPr>
+        <w:t xml:space="preserve">nunc </w:t>
+      </w:r>
+      <w:r>
+        <w:rPr>
+          <w:lang w:val="fr-FR"/>
+        </w:rPr>
+        <w:t>Episcopo et success’ suis ex dono nostro absque [eol]</w:t>
       </w:r>
     </w:p>
     <w:p>
@@ -1914,7 +1926,19 @@
         <w:rPr>
           <w:lang w:val="fr-FR"/>
         </w:rPr>
-        <w:t xml:space="preserve"> quoquomodo Reddend solvend vel faciend Et ulterius ex speciali gracia nostra certa sciencia et mero</w:t>
+        <w:t xml:space="preserve"> quoquomodo Reddend solvend vel faciend </w:t>
+      </w:r>
+      <w:r>
+        <w:rPr>
+          <w:lang w:val="fr-FR"/>
+        </w:rPr>
+        <w:t xml:space="preserve">[ab 11] </w:t>
+      </w:r>
+      <w:r>
+        <w:rPr>
+          <w:lang w:val="fr-FR"/>
+        </w:rPr>
+        <w:t>Et ulterius ex speciali gracia nostra certa sciencia et mero</w:t>
       </w:r>
       <w:r>
         <w:rPr>
@@ -1960,7 +1984,7 @@
         <w:rPr>
           <w:lang w:val="fr-FR"/>
         </w:rPr>
-        <w:t>[[line 27]</w:t>
+        <w:t>[line 27]</w:t>
       </w:r>
       <w:r>
         <w:rPr>
@@ -2054,7 +2078,19 @@
         <w:rPr>
           <w:lang w:val="fr-FR"/>
         </w:rPr>
-        <w:t>tempore quoquomodo spectan’ sive pertin’ Aceciam Volumus et per presentes concedimus prefato nunc Episcopo quot habeat h</w:t>
+        <w:t>tempore quoquomodo spectan’ sive pertin’ Aceciam Volumus et per presentes concedimus prefato nunc Episcopo quo</w:t>
+      </w:r>
+      <w:r>
+        <w:rPr>
+          <w:lang w:val="fr-FR"/>
+        </w:rPr>
+        <w:t>d</w:t>
+      </w:r>
+      <w:r>
+        <w:rPr>
+          <w:lang w:val="fr-FR"/>
+        </w:rPr>
+        <w:t xml:space="preserve"> habeat h</w:t>
       </w:r>
       <w:r>
         <w:rPr>

</xml_diff>

<commit_message>
finished collating Z, now need to go back over other witnesses
</commit_message>
<xml_diff>
--- a/C82Brecon.docx
+++ b/C82Brecon.docx
@@ -2154,13 +2154,37 @@
         <w:rPr>
           <w:lang w:val="fr-FR"/>
         </w:rPr>
-        <w:t>vel faciendo Eo quod expressa mencio de certitudine aut valore premissorum aut de aliis ^[above :</w:t>
-      </w:r>
-      <w:r>
-        <w:rPr>
-          <w:lang w:val="fr-FR"/>
-        </w:rPr>
-        <w:t xml:space="preserve"> donis] concessionibus per nos vel Aliquem progenitorum </w:t>
+        <w:t xml:space="preserve">vel faciendo </w:t>
+      </w:r>
+      <w:r>
+        <w:rPr>
+          <w:lang w:val="fr-FR"/>
+        </w:rPr>
+        <w:t xml:space="preserve">[ab 12] </w:t>
+      </w:r>
+      <w:r>
+        <w:rPr>
+          <w:lang w:val="fr-FR"/>
+        </w:rPr>
+        <w:t>Eo quod expressa mencio de certitudine aut valore premissorum aut de aliis ^[above :</w:t>
+      </w:r>
+      <w:r>
+        <w:rPr>
+          <w:lang w:val="fr-FR"/>
+        </w:rPr>
+        <w:t xml:space="preserve"> donis] </w:t>
+      </w:r>
+      <w:r>
+        <w:rPr>
+          <w:lang w:val="fr-FR"/>
+        </w:rPr>
+        <w:t xml:space="preserve">sive </w:t>
+      </w:r>
+      <w:r>
+        <w:rPr>
+          <w:lang w:val="fr-FR"/>
+        </w:rPr>
+        <w:t xml:space="preserve">concessionibus per nos vel Aliquem progenitorum </w:t>
       </w:r>
       <w:r>
         <w:rPr>
@@ -2243,7 +2267,19 @@
         <w:rPr>
           <w:lang w:val="fr-FR"/>
         </w:rPr>
-        <w:t>^[above : in aliq] non obstant Insuper noverit’ quod nos de gracia</w:t>
+        <w:t xml:space="preserve">^[above : in aliq] non obstant </w:t>
+      </w:r>
+      <w:r>
+        <w:rPr>
+          <w:lang w:val="fr-FR"/>
+        </w:rPr>
+        <w:t xml:space="preserve">[ab 13] </w:t>
+      </w:r>
+      <w:r>
+        <w:rPr>
+          <w:lang w:val="fr-FR"/>
+        </w:rPr>
+        <w:t>Insuper noverit’ quod nos de gracia</w:t>
       </w:r>
       <w:r>
         <w:rPr>
@@ -2401,7 +2437,25 @@
         <w:rPr>
           <w:lang w:val="fr-FR"/>
         </w:rPr>
-        <w:t>Et quod ipsi libere et impune valeant quondam Ludum Litterarium erigere et fundare [eol]</w:t>
+        <w:t xml:space="preserve">[ab 14] </w:t>
+      </w:r>
+      <w:r>
+        <w:rPr>
+          <w:lang w:val="fr-FR"/>
+        </w:rPr>
+        <w:t>Et quod ipsi libere et impune valeant qu</w:t>
+      </w:r>
+      <w:r>
+        <w:rPr>
+          <w:lang w:val="fr-FR"/>
+        </w:rPr>
+        <w:t>e</w:t>
+      </w:r>
+      <w:r>
+        <w:rPr>
+          <w:lang w:val="fr-FR"/>
+        </w:rPr>
+        <w:t>ndam Ludum Litterarium erigere et fundare [eol]</w:t>
       </w:r>
     </w:p>
     <w:p>
@@ -2830,6 +2884,12 @@
         <w:rPr>
           <w:lang w:val="fr-FR"/>
         </w:rPr>
+        <w:t xml:space="preserve">[ab 16] </w:t>
+      </w:r>
+      <w:r>
+        <w:rPr>
+          <w:lang w:val="fr-FR"/>
+        </w:rPr>
         <w:t>Et quod antedictus [</w:t>
       </w:r>
       <w:r>
@@ -2892,7 +2952,31 @@
         <w:rPr>
           <w:lang w:val="fr-FR"/>
         </w:rPr>
-        <w:t>ludo Magistri Pedagogi Lectores Concionatores ac alio person</w:t>
+        <w:t>lud</w:t>
+      </w:r>
+      <w:r>
+        <w:rPr>
+          <w:lang w:val="fr-FR"/>
+        </w:rPr>
+        <w:t>i</w:t>
+      </w:r>
+      <w:r>
+        <w:rPr>
+          <w:lang w:val="fr-FR"/>
+        </w:rPr>
+        <w:t xml:space="preserve"> Magistri Pedagogi Lectores Concionatores ac ali</w:t>
+      </w:r>
+      <w:r>
+        <w:rPr>
+          <w:lang w:val="fr-FR"/>
+        </w:rPr>
+        <w:t>e</w:t>
+      </w:r>
+      <w:r>
+        <w:rPr>
+          <w:lang w:val="fr-FR"/>
+        </w:rPr>
+        <w:t xml:space="preserve"> person</w:t>
       </w:r>
       <w:r>
         <w:rPr>
@@ -2935,7 +3019,19 @@
         <w:rPr>
           <w:lang w:val="fr-FR"/>
         </w:rPr>
-        <w:t xml:space="preserve">oppidum de Breknok et in ecclesia predicte </w:t>
+        <w:t>oppidum de Breknok et in ecclesia predict</w:t>
+      </w:r>
+      <w:r>
+        <w:rPr>
+          <w:lang w:val="fr-FR"/>
+        </w:rPr>
+        <w:t>a</w:t>
+      </w:r>
+      <w:r>
+        <w:rPr>
+          <w:lang w:val="fr-FR"/>
+        </w:rPr>
+        <w:t xml:space="preserve"> </w:t>
       </w:r>
       <w:r>
         <w:rPr>
@@ -2979,7 +3075,19 @@
         <w:rPr>
           <w:lang w:val="fr-FR"/>
         </w:rPr>
-        <w:t>cumque dicto nuper Prioratui spectan’ et infra ambitum et pr</w:t>
+        <w:t>cu</w:t>
+      </w:r>
+      <w:r>
+        <w:rPr>
+          <w:lang w:val="fr-FR"/>
+        </w:rPr>
+        <w:t>’</w:t>
+      </w:r>
+      <w:r>
+        <w:rPr>
+          <w:lang w:val="fr-FR"/>
+        </w:rPr>
+        <w:t>que dicto nuper Prioratui spectan’ et infra ambitum et pr</w:t>
       </w:r>
       <w:r>
         <w:rPr>
@@ -2997,7 +3105,19 @@
         <w:rPr>
           <w:lang w:val="fr-FR"/>
         </w:rPr>
-        <w:t xml:space="preserve">cohabitare recedere possunt et manere Et quod idem </w:t>
+        <w:t xml:space="preserve">cohabitare recedere possunt et manere </w:t>
+      </w:r>
+      <w:r>
+        <w:rPr>
+          <w:lang w:val="fr-FR"/>
+        </w:rPr>
+        <w:t xml:space="preserve">[ab 17] </w:t>
+      </w:r>
+      <w:r>
+        <w:rPr>
+          <w:lang w:val="fr-FR"/>
+        </w:rPr>
+        <w:t xml:space="preserve">Et quod idem </w:t>
       </w:r>
       <w:r>
         <w:rPr>
@@ -3091,6 +3211,7 @@
         <w:rPr>
           <w:lang w:val="pt-BR"/>
         </w:rPr>
+        <w:lastRenderedPageBreak/>
         <w:t>[line 4</w:t>
       </w:r>
       <w:r>
@@ -3153,14 +3274,7 @@
         <w:rPr>
           <w:lang w:val="pt-BR"/>
         </w:rPr>
-        <w:t xml:space="preserve">cecomit’ ballivorum servient’ Officiar’ vel Ministr’ nostrorum hered’ aut Succ’ nostrorum </w:t>
-      </w:r>
-      <w:r>
-        <w:rPr>
-          <w:lang w:val="pt-BR"/>
-        </w:rPr>
-        <w:lastRenderedPageBreak/>
-        <w:t xml:space="preserve">quorumcu’que vel eorum </w:t>
+        <w:t xml:space="preserve">cecomit’ ballivorum servient’ Officiar’ vel Ministr’ nostrorum hered’ aut Succ’ nostrorum quorumcu’que vel eorum </w:t>
       </w:r>
       <w:r>
         <w:rPr>
@@ -3172,7 +3286,19 @@
         <w:rPr>
           <w:lang w:val="pt-BR"/>
         </w:rPr>
-        <w:t xml:space="preserve">tare fac’ Et ulterius volumus et concedimus per presentes de speciali gracia nosta certa </w:t>
+        <w:t xml:space="preserve">tare fac’ </w:t>
+      </w:r>
+      <w:r>
+        <w:rPr>
+          <w:lang w:val="pt-BR"/>
+        </w:rPr>
+        <w:t xml:space="preserve">[ab 18] </w:t>
+      </w:r>
+      <w:r>
+        <w:rPr>
+          <w:lang w:val="pt-BR"/>
+        </w:rPr>
+        <w:t xml:space="preserve">Et ulterius volumus et concedimus per presentes de speciali gracia nosta certa </w:t>
       </w:r>
       <w:r>
         <w:rPr>
@@ -3277,166 +3403,172 @@
       <w:pPr>
         <w:ind w:left="720" w:right="-720" w:hanging="720"/>
         <w:rPr>
-          <w:lang w:val="fr-FR"/>
-        </w:rPr>
-      </w:pPr>
-      <w:r>
-        <w:rPr>
-          <w:lang w:val="fr-FR"/>
+          <w:lang w:val="pt-BR"/>
+        </w:rPr>
+      </w:pPr>
+      <w:r>
+        <w:rPr>
+          <w:lang w:val="pt-BR"/>
         </w:rPr>
         <w:t xml:space="preserve">[line </w:t>
       </w:r>
       <w:r>
         <w:rPr>
-          <w:lang w:val="fr-FR"/>
+          <w:lang w:val="pt-BR"/>
         </w:rPr>
         <w:t>4</w:t>
       </w:r>
       <w:r>
         <w:rPr>
-          <w:lang w:val="fr-FR"/>
+          <w:lang w:val="pt-BR"/>
         </w:rPr>
         <w:t>3</w:t>
       </w:r>
       <w:r>
         <w:rPr>
-          <w:lang w:val="fr-FR"/>
+          <w:lang w:val="pt-BR"/>
         </w:rPr>
         <w:t xml:space="preserve">] </w:t>
       </w:r>
       <w:r>
         <w:rPr>
-          <w:lang w:val="fr-FR"/>
+          <w:lang w:val="pt-BR"/>
         </w:rPr>
         <w:t>imperpetuum omnia et omnimod’ maneria mesuagia terras et tenementa</w:t>
       </w:r>
       <w:r>
         <w:rPr>
-          <w:lang w:val="fr-FR"/>
+          <w:lang w:val="pt-BR"/>
         </w:rPr>
         <w:t xml:space="preserve"> Reddit Reverciones</w:t>
       </w:r>
       <w:r>
         <w:rPr>
-          <w:lang w:val="fr-FR"/>
+          <w:lang w:val="pt-BR"/>
         </w:rPr>
         <w:t xml:space="preserve"> et ser</w:t>
       </w:r>
       <w:r>
         <w:rPr>
-          <w:lang w:val="fr-FR"/>
+          <w:lang w:val="pt-BR"/>
         </w:rPr>
         <w:t xml:space="preserve">vicia advocaciones Ecclesiarum Vicar’ et Capellarum proficua emolumenta commoditat’ et hereditamenta </w:t>
       </w:r>
       <w:r>
         <w:rPr>
-          <w:lang w:val="fr-FR"/>
+          <w:lang w:val="pt-BR"/>
         </w:rPr>
         <w:t xml:space="preserve">libertates franchesias </w:t>
       </w:r>
       <w:r>
         <w:rPr>
-          <w:lang w:val="fr-FR"/>
+          <w:lang w:val="pt-BR"/>
         </w:rPr>
         <w:t>p</w:t>
       </w:r>
       <w:r>
         <w:rPr>
-          <w:lang w:val="fr-FR"/>
-        </w:rPr>
-        <w:t>r[e]eminentias et Jura quecumque Aliquo modo ant</w:t>
-      </w:r>
-      <w:r>
-        <w:rPr>
-          <w:lang w:val="fr-FR"/>
-        </w:rPr>
-        <w:t>e hac dat’ concess’ debit’ vel spectan’ [eol]</w:t>
-      </w:r>
-    </w:p>
-    <w:p>
-      <w:pPr>
-        <w:ind w:left="720" w:right="-720" w:hanging="720"/>
-        <w:rPr>
-          <w:lang w:val="fr-FR"/>
-        </w:rPr>
-      </w:pPr>
-      <w:r>
-        <w:rPr>
-          <w:lang w:val="fr-FR"/>
+          <w:lang w:val="pt-BR"/>
+        </w:rPr>
+        <w:t>r[e]eminentias et Jura quecu</w:t>
+      </w:r>
+      <w:r>
+        <w:rPr>
+          <w:lang w:val="pt-BR"/>
+        </w:rPr>
+        <w:t>’</w:t>
+      </w:r>
+      <w:r>
+        <w:rPr>
+          <w:lang w:val="pt-BR"/>
+        </w:rPr>
+        <w:t>que Aliquo modo ante hac dat’ concess’ debit’ vel spectan’ [eol]</w:t>
+      </w:r>
+    </w:p>
+    <w:p>
+      <w:pPr>
+        <w:ind w:left="720" w:right="-720" w:hanging="720"/>
+        <w:rPr>
+          <w:lang w:val="pt-BR"/>
+        </w:rPr>
+      </w:pPr>
+      <w:r>
+        <w:rPr>
+          <w:lang w:val="pt-BR"/>
         </w:rPr>
         <w:t xml:space="preserve">[line </w:t>
       </w:r>
       <w:r>
         <w:rPr>
-          <w:lang w:val="fr-FR"/>
+          <w:lang w:val="pt-BR"/>
         </w:rPr>
         <w:t>4</w:t>
       </w:r>
       <w:r>
         <w:rPr>
-          <w:lang w:val="fr-FR"/>
+          <w:lang w:val="pt-BR"/>
         </w:rPr>
         <w:t>4</w:t>
       </w:r>
       <w:r>
         <w:rPr>
-          <w:lang w:val="fr-FR"/>
+          <w:lang w:val="pt-BR"/>
         </w:rPr>
         <w:t xml:space="preserve">] </w:t>
       </w:r>
       <w:r>
         <w:rPr>
-          <w:lang w:val="fr-FR"/>
+          <w:lang w:val="pt-BR"/>
         </w:rPr>
         <w:t>dicto Collegio de Alberguylly</w:t>
       </w:r>
       <w:r>
         <w:rPr>
-          <w:lang w:val="fr-FR"/>
-        </w:rPr>
-        <w:t xml:space="preserve"> vel fabrice dict’ Colleg’ Et quod ipsi</w:t>
-      </w:r>
-      <w:r>
-        <w:rPr>
-          <w:lang w:val="fr-FR"/>
+          <w:lang w:val="pt-BR"/>
+        </w:rPr>
+        <w:t xml:space="preserve"> vel fabrice dict’ Colleg’ </w:t>
+      </w:r>
+      <w:r>
+        <w:rPr>
+          <w:lang w:val="pt-BR"/>
+        </w:rPr>
+        <w:t xml:space="preserve"> </w:t>
+      </w:r>
+      <w:r>
+        <w:rPr>
+          <w:lang w:val="pt-BR"/>
+        </w:rPr>
+        <w:t xml:space="preserve">[ab 19] </w:t>
+      </w:r>
+      <w:r>
+        <w:rPr>
+          <w:lang w:val="pt-BR"/>
+        </w:rPr>
+        <w:t>Et quod ipsi</w:t>
+      </w:r>
+      <w:r>
+        <w:rPr>
+          <w:lang w:val="pt-BR"/>
         </w:rPr>
         <w:t xml:space="preserve"> nunc</w:t>
       </w:r>
       <w:r>
         <w:rPr>
-          <w:lang w:val="fr-FR"/>
+          <w:lang w:val="pt-BR"/>
         </w:rPr>
         <w:t xml:space="preserve"> Episcopus Meneven’ Canonici Residentar’ prebendar’ Vicar’ Choriste vel Colegiati Alii ve </w:t>
       </w:r>
       <w:r>
         <w:rPr>
-          <w:lang w:val="fr-FR"/>
+          <w:lang w:val="pt-BR"/>
         </w:rPr>
         <w:t xml:space="preserve">ministr’ quicu’que dicti </w:t>
       </w:r>
       <w:r>
         <w:rPr>
-          <w:lang w:val="fr-FR"/>
-        </w:rPr>
-        <w:t>Collegii de Alberguylly et Succ</w:t>
-      </w:r>
-      <w:r>
-        <w:rPr>
-          <w:lang w:val="fr-FR"/>
-        </w:rPr>
-        <w:t>’</w:t>
-      </w:r>
-      <w:r>
-        <w:rPr>
-          <w:lang w:val="fr-FR"/>
-        </w:rPr>
-        <w:t xml:space="preserve"> sui h</w:t>
-      </w:r>
-      <w:r>
-        <w:rPr>
-          <w:lang w:val="fr-FR"/>
-        </w:rPr>
-        <w:t>abeant gaudeant et utuntur omnibus et omnimod’ [eol]</w:t>
+          <w:lang w:val="pt-BR"/>
+        </w:rPr>
+        <w:t>Collegii de Alberguylly et Succ’ sui habeant gaudeant et utuntur omnibus et omnimod’ [eol]</w:t>
       </w:r>
     </w:p>
     <w:p>
@@ -3578,13 +3710,239 @@
         <w:rPr>
           <w:lang w:val="fr-FR"/>
         </w:rPr>
-        <w:tab/>
-      </w:r>
-      <w:r>
-        <w:rPr>
-          <w:lang w:val="fr-FR"/>
-        </w:rPr>
-        <w:t>vel uti solebat vel debuit</w:t>
+        <w:t xml:space="preserve"> </w:t>
+      </w:r>
+      <w:r>
+        <w:rPr>
+          <w:lang w:val="fr-FR"/>
+        </w:rPr>
+        <w:t xml:space="preserve">vel uti solebat vel debuit </w:t>
+      </w:r>
+      <w:r>
+        <w:rPr>
+          <w:lang w:val="fr-FR"/>
+        </w:rPr>
+        <w:t>ad opus et usum sustent</w:t>
+      </w:r>
+      <w:r>
+        <w:rPr>
+          <w:lang w:val="fr-FR"/>
+        </w:rPr>
+        <w:t xml:space="preserve">acionis et manutent’ predicti Collegii Xpi de Brechnok </w:t>
+      </w:r>
+      <w:r>
+        <w:rPr>
+          <w:lang w:val="fr-FR"/>
+        </w:rPr>
+        <w:t xml:space="preserve">[ab 20] </w:t>
+      </w:r>
+      <w:r>
+        <w:rPr>
+          <w:lang w:val="fr-FR"/>
+        </w:rPr>
+        <w:t>Ac ea omnia et singula [eol]</w:t>
+      </w:r>
+    </w:p>
+    <w:p>
+      <w:pPr>
+        <w:ind w:left="720" w:right="-720" w:hanging="720"/>
+        <w:rPr>
+          <w:lang w:val="fr-FR"/>
+        </w:rPr>
+      </w:pPr>
+      <w:r>
+        <w:rPr>
+          <w:lang w:val="fr-FR"/>
+        </w:rPr>
+        <w:t xml:space="preserve">[line </w:t>
+      </w:r>
+      <w:r>
+        <w:rPr>
+          <w:lang w:val="fr-FR"/>
+        </w:rPr>
+        <w:t>4</w:t>
+      </w:r>
+      <w:r>
+        <w:rPr>
+          <w:lang w:val="fr-FR"/>
+        </w:rPr>
+        <w:t>7</w:t>
+      </w:r>
+      <w:r>
+        <w:rPr>
+          <w:lang w:val="fr-FR"/>
+        </w:rPr>
+        <w:t xml:space="preserve">] </w:t>
+      </w:r>
+      <w:r>
+        <w:rPr>
+          <w:lang w:val="fr-FR"/>
+        </w:rPr>
+        <w:t>premiss’ Priorat’ Colleg’ maneria mesuag’ terr’ et Tenementa</w:t>
+      </w:r>
+      <w:r>
+        <w:rPr>
+          <w:lang w:val="fr-FR"/>
+        </w:rPr>
+        <w:t xml:space="preserve"> Ac omnia A</w:t>
+      </w:r>
+      <w:r>
+        <w:rPr>
+          <w:lang w:val="fr-FR"/>
+        </w:rPr>
+        <w:t xml:space="preserve">lia Jura commoditat proficua et hereditamenta quecu’que que Aliquo tempore habita cognita accept’ </w:t>
+      </w:r>
+      <w:r>
+        <w:rPr>
+          <w:lang w:val="fr-FR"/>
+        </w:rPr>
+        <w:t>Reputat’ vel c</w:t>
+      </w:r>
+      <w:r>
+        <w:rPr>
+          <w:lang w:val="fr-FR"/>
+        </w:rPr>
+        <w:t>apt’ fuer’ ut partes parcell’ sive membra dicti nuper priorat’ Colle</w:t>
+      </w:r>
+      <w:r>
+        <w:rPr>
+          <w:lang w:val="fr-FR"/>
+        </w:rPr>
+        <w:t>g</w:t>
+      </w:r>
+      <w:r>
+        <w:rPr>
+          <w:lang w:val="fr-FR"/>
+        </w:rPr>
+        <w:t>’ maneriorum [eol]</w:t>
+      </w:r>
+    </w:p>
+    <w:p>
+      <w:pPr>
+        <w:ind w:left="720" w:right="-720" w:hanging="720"/>
+        <w:rPr>
+          <w:lang w:val="fr-FR"/>
+        </w:rPr>
+      </w:pPr>
+      <w:r>
+        <w:rPr>
+          <w:lang w:val="fr-FR"/>
+        </w:rPr>
+        <w:t>[</w:t>
+      </w:r>
+      <w:r>
+        <w:rPr>
+          <w:lang w:val="fr-FR"/>
+        </w:rPr>
+        <w:t xml:space="preserve">line </w:t>
+      </w:r>
+      <w:r>
+        <w:rPr>
+          <w:lang w:val="fr-FR"/>
+        </w:rPr>
+        <w:t>4</w:t>
+      </w:r>
+      <w:r>
+        <w:rPr>
+          <w:lang w:val="fr-FR"/>
+        </w:rPr>
+        <w:t>8</w:t>
+      </w:r>
+      <w:r>
+        <w:rPr>
+          <w:lang w:val="fr-FR"/>
+        </w:rPr>
+        <w:t xml:space="preserve">] </w:t>
+      </w:r>
+      <w:r>
+        <w:rPr>
+          <w:lang w:val="fr-FR"/>
+        </w:rPr>
+        <w:t xml:space="preserve">mesuag’ terr’ et tent’ Reddit’ </w:t>
+      </w:r>
+      <w:r>
+        <w:rPr>
+          <w:lang w:val="fr-FR"/>
+        </w:rPr>
+        <w:t>R</w:t>
+      </w:r>
+      <w:r>
+        <w:rPr>
+          <w:lang w:val="fr-FR"/>
+        </w:rPr>
+        <w:t>ever</w:t>
+      </w:r>
+      <w:r>
+        <w:rPr>
+          <w:lang w:val="fr-FR"/>
+        </w:rPr>
+        <w:t>c</w:t>
+      </w:r>
+      <w:r>
+        <w:rPr>
+          <w:lang w:val="fr-FR"/>
+        </w:rPr>
+        <w:t xml:space="preserve">ion’ </w:t>
+      </w:r>
+      <w:r>
+        <w:rPr>
+          <w:lang w:val="fr-FR"/>
+        </w:rPr>
+        <w:t>vel servic’ au</w:t>
+      </w:r>
+      <w:r>
+        <w:rPr>
+          <w:lang w:val="fr-FR"/>
+        </w:rPr>
+        <w:t xml:space="preserve">t </w:t>
+      </w:r>
+      <w:r>
+        <w:rPr>
+          <w:lang w:val="fr-FR"/>
+        </w:rPr>
+        <w:t xml:space="preserve">ceterorum premiss’m sive Alicuius inde parcell’ vel premiss’ aut alicui premiss’ </w:t>
+      </w:r>
+      <w:r>
+        <w:rPr>
+          <w:lang w:val="fr-FR"/>
+        </w:rPr>
+        <w:t xml:space="preserve">aliquo modo append’ pertinen’ sive </w:t>
+      </w:r>
+      <w:r>
+        <w:rPr>
+          <w:lang w:val="fr-FR"/>
+        </w:rPr>
+        <w:t>spectan’ ex speci</w:t>
+      </w:r>
+      <w:r>
+        <w:rPr>
+          <w:lang w:val="fr-FR"/>
+        </w:rPr>
+        <w:t>ali gracia nostra certa sciencia et mer</w:t>
+      </w:r>
+      <w:r>
+        <w:rPr>
+          <w:lang w:val="fr-FR"/>
+        </w:rPr>
+        <w:t>o</w:t>
+      </w:r>
+      <w:r>
+        <w:rPr>
+          <w:lang w:val="fr-FR"/>
+        </w:rPr>
+        <w:t xml:space="preserve"> motu nostris Damus concedimus et confirma</w:t>
+      </w:r>
+      <w:r>
+        <w:rPr>
+          <w:lang w:val="fr-FR"/>
+        </w:rPr>
+        <w:t>vimu</w:t>
+      </w:r>
+      <w:r>
+        <w:rPr>
+          <w:lang w:val="fr-FR"/>
+        </w:rPr>
+        <w:t>s</w:t>
       </w:r>
       <w:r>
         <w:rPr>
@@ -3597,19 +3955,75 @@
         <w:rPr>
           <w:lang w:val="fr-FR"/>
         </w:rPr>
+        <w:t xml:space="preserve"> [eol]</w:t>
+      </w:r>
+    </w:p>
+    <w:p>
+      <w:pPr>
+        <w:ind w:left="720" w:right="-720" w:hanging="720"/>
+        <w:rPr>
+          <w:lang w:val="fr-FR"/>
+        </w:rPr>
+      </w:pPr>
+      <w:r>
+        <w:rPr>
+          <w:lang w:val="fr-FR"/>
+        </w:rPr>
+        <w:t xml:space="preserve">[line </w:t>
+      </w:r>
+      <w:r>
+        <w:rPr>
+          <w:lang w:val="fr-FR"/>
+        </w:rPr>
+        <w:t>4</w:t>
+      </w:r>
+      <w:r>
+        <w:rPr>
+          <w:lang w:val="fr-FR"/>
+        </w:rPr>
+        <w:t>9</w:t>
+      </w:r>
+      <w:r>
+        <w:rPr>
+          <w:lang w:val="fr-FR"/>
+        </w:rPr>
+        <w:t xml:space="preserve">] </w:t>
+      </w:r>
+      <w:r>
+        <w:rPr>
+          <w:lang w:val="fr-FR"/>
+        </w:rPr>
+        <w:t>per presentes dicto nunc Episcopo Meneven' et successor’ suis tam libere et effectualiter</w:t>
+      </w:r>
+      <w:r>
+        <w:rPr>
+          <w:lang w:val="fr-FR"/>
+        </w:rPr>
+        <w:t xml:space="preserve"> bene sufficienter et integraliter Ac si omnia et </w:t>
+      </w:r>
+      <w:r>
+        <w:rPr>
+          <w:lang w:val="fr-FR"/>
+        </w:rPr>
+        <w:t>singula premiss’ cum suis pertinenc’ universis</w:t>
+      </w:r>
+      <w:r>
+        <w:rPr>
+          <w:lang w:val="fr-FR"/>
+        </w:rPr>
         <w:t xml:space="preserve"> </w:t>
       </w:r>
       <w:r>
         <w:rPr>
           <w:lang w:val="fr-FR"/>
         </w:rPr>
-        <w:t>ad opus et usum sustent</w:t>
-      </w:r>
-      <w:r>
-        <w:rPr>
-          <w:lang w:val="fr-FR"/>
-        </w:rPr>
-        <w:t>acionis et manutent’ predicti Collegii Xpi de Brechnok Ac ea omnia et singula [eol]</w:t>
+        <w:t>realiter dis</w:t>
+      </w:r>
+      <w:r>
+        <w:rPr>
+          <w:lang w:val="fr-FR"/>
+        </w:rPr>
+        <w:t>tincte nominatim specialiter ac Certitudinaliter melioribus modis viis et mediis ac [eol]</w:t>
       </w:r>
     </w:p>
     <w:p>
@@ -3629,13 +4043,7 @@
         <w:rPr>
           <w:lang w:val="fr-FR"/>
         </w:rPr>
-        <w:t>4</w:t>
-      </w:r>
-      <w:r>
-        <w:rPr>
-          <w:lang w:val="fr-FR"/>
-        </w:rPr>
-        <w:t>7</w:t>
+        <w:t>50</w:t>
       </w:r>
       <w:r>
         <w:rPr>
@@ -3647,283 +4055,6 @@
         <w:rPr>
           <w:lang w:val="fr-FR"/>
         </w:rPr>
-        <w:t>premiss’ Priorat’ Colleg’ maneria mesuag’ terr’ et Tenementa</w:t>
-      </w:r>
-      <w:r>
-        <w:rPr>
-          <w:lang w:val="fr-FR"/>
-        </w:rPr>
-        <w:t xml:space="preserve"> Ac omnia A</w:t>
-      </w:r>
-      <w:r>
-        <w:rPr>
-          <w:lang w:val="fr-FR"/>
-        </w:rPr>
-        <w:t xml:space="preserve">lia Jura commoditat proficua et hereditamenta quecu’que que Aliquo tempore habita cognita accept’ </w:t>
-      </w:r>
-      <w:r>
-        <w:rPr>
-          <w:lang w:val="fr-FR"/>
-        </w:rPr>
-        <w:t>Reputat’ vel c</w:t>
-      </w:r>
-      <w:r>
-        <w:rPr>
-          <w:lang w:val="fr-FR"/>
-        </w:rPr>
-        <w:t>apt’ fuer’ ut partes parcell’ sive membra dicti nuper priorat’ Colle</w:t>
-      </w:r>
-      <w:r>
-        <w:rPr>
-          <w:lang w:val="fr-FR"/>
-        </w:rPr>
-        <w:t>g</w:t>
-      </w:r>
-      <w:r>
-        <w:rPr>
-          <w:lang w:val="fr-FR"/>
-        </w:rPr>
-        <w:t>’ maneriorum [eol]</w:t>
-      </w:r>
-    </w:p>
-    <w:p>
-      <w:pPr>
-        <w:ind w:left="720" w:right="-720" w:hanging="720"/>
-        <w:rPr>
-          <w:lang w:val="fr-FR"/>
-        </w:rPr>
-      </w:pPr>
-      <w:r>
-        <w:rPr>
-          <w:lang w:val="fr-FR"/>
-        </w:rPr>
-        <w:t>[</w:t>
-      </w:r>
-      <w:r>
-        <w:rPr>
-          <w:lang w:val="fr-FR"/>
-        </w:rPr>
-        <w:t xml:space="preserve">line </w:t>
-      </w:r>
-      <w:r>
-        <w:rPr>
-          <w:lang w:val="fr-FR"/>
-        </w:rPr>
-        <w:t>4</w:t>
-      </w:r>
-      <w:r>
-        <w:rPr>
-          <w:lang w:val="fr-FR"/>
-        </w:rPr>
-        <w:t>8</w:t>
-      </w:r>
-      <w:r>
-        <w:rPr>
-          <w:lang w:val="fr-FR"/>
-        </w:rPr>
-        <w:t xml:space="preserve">] </w:t>
-      </w:r>
-      <w:r>
-        <w:rPr>
-          <w:lang w:val="fr-FR"/>
-        </w:rPr>
-        <w:t xml:space="preserve">mesuag’ terr’ et tent’ Reddit’ </w:t>
-      </w:r>
-      <w:r>
-        <w:rPr>
-          <w:lang w:val="fr-FR"/>
-        </w:rPr>
-        <w:t>R</w:t>
-      </w:r>
-      <w:r>
-        <w:rPr>
-          <w:lang w:val="fr-FR"/>
-        </w:rPr>
-        <w:t>ever</w:t>
-      </w:r>
-      <w:r>
-        <w:rPr>
-          <w:lang w:val="fr-FR"/>
-        </w:rPr>
-        <w:t>c</w:t>
-      </w:r>
-      <w:r>
-        <w:rPr>
-          <w:lang w:val="fr-FR"/>
-        </w:rPr>
-        <w:t xml:space="preserve">ion’ </w:t>
-      </w:r>
-      <w:r>
-        <w:rPr>
-          <w:lang w:val="fr-FR"/>
-        </w:rPr>
-        <w:t>vel servic’ au</w:t>
-      </w:r>
-      <w:r>
-        <w:rPr>
-          <w:lang w:val="fr-FR"/>
-        </w:rPr>
-        <w:t xml:space="preserve">t </w:t>
-      </w:r>
-      <w:r>
-        <w:rPr>
-          <w:lang w:val="fr-FR"/>
-        </w:rPr>
-        <w:t xml:space="preserve">ceterorum premiss’m sive Alicuius inde parcell’ vel premiss’ aut alicui premiss’ </w:t>
-      </w:r>
-      <w:r>
-        <w:rPr>
-          <w:lang w:val="fr-FR"/>
-        </w:rPr>
-        <w:t xml:space="preserve">aliquo modo append’ pertinen’ sive </w:t>
-      </w:r>
-      <w:r>
-        <w:rPr>
-          <w:lang w:val="fr-FR"/>
-        </w:rPr>
-        <w:t>spectan’ ex speci</w:t>
-      </w:r>
-      <w:r>
-        <w:rPr>
-          <w:lang w:val="fr-FR"/>
-        </w:rPr>
-        <w:t>ali gracia nostra certa sciencia et mer</w:t>
-      </w:r>
-      <w:r>
-        <w:rPr>
-          <w:lang w:val="fr-FR"/>
-        </w:rPr>
-        <w:t>o</w:t>
-      </w:r>
-      <w:r>
-        <w:rPr>
-          <w:lang w:val="fr-FR"/>
-        </w:rPr>
-        <w:t xml:space="preserve"> motu nostris Damus concedimus et confirma</w:t>
-      </w:r>
-      <w:r>
-        <w:rPr>
-          <w:lang w:val="fr-FR"/>
-        </w:rPr>
-        <w:t>vimu</w:t>
-      </w:r>
-      <w:r>
-        <w:rPr>
-          <w:lang w:val="fr-FR"/>
-        </w:rPr>
-        <w:t>s</w:t>
-      </w:r>
-      <w:r>
-        <w:rPr>
-          <w:rStyle w:val="FootnoteReference"/>
-          <w:lang w:val="fr-FR"/>
-        </w:rPr>
-        <w:footnoteReference w:id="3"/>
-      </w:r>
-      <w:r>
-        <w:rPr>
-          <w:lang w:val="fr-FR"/>
-        </w:rPr>
-        <w:t xml:space="preserve"> [eol]</w:t>
-      </w:r>
-    </w:p>
-    <w:p>
-      <w:pPr>
-        <w:ind w:left="720" w:right="-720" w:hanging="720"/>
-        <w:rPr>
-          <w:lang w:val="fr-FR"/>
-        </w:rPr>
-      </w:pPr>
-      <w:r>
-        <w:rPr>
-          <w:lang w:val="fr-FR"/>
-        </w:rPr>
-        <w:t xml:space="preserve">[line </w:t>
-      </w:r>
-      <w:r>
-        <w:rPr>
-          <w:lang w:val="fr-FR"/>
-        </w:rPr>
-        <w:t>4</w:t>
-      </w:r>
-      <w:r>
-        <w:rPr>
-          <w:lang w:val="fr-FR"/>
-        </w:rPr>
-        <w:t>9</w:t>
-      </w:r>
-      <w:r>
-        <w:rPr>
-          <w:lang w:val="fr-FR"/>
-        </w:rPr>
-        <w:t xml:space="preserve">] </w:t>
-      </w:r>
-      <w:r>
-        <w:rPr>
-          <w:lang w:val="fr-FR"/>
-        </w:rPr>
-        <w:t>per presentes dicto nunc Episcopo Meneven' et successor’ suis tam libere et effectualiter</w:t>
-      </w:r>
-      <w:r>
-        <w:rPr>
-          <w:lang w:val="fr-FR"/>
-        </w:rPr>
-        <w:t xml:space="preserve"> bene sufficienter et integraliter Ac si omnia et </w:t>
-      </w:r>
-      <w:r>
-        <w:rPr>
-          <w:lang w:val="fr-FR"/>
-        </w:rPr>
-        <w:t>singula premiss’ cum suis pertinenc’ universis</w:t>
-      </w:r>
-      <w:r>
-        <w:rPr>
-          <w:lang w:val="fr-FR"/>
-        </w:rPr>
-        <w:t xml:space="preserve"> </w:t>
-      </w:r>
-      <w:r>
-        <w:rPr>
-          <w:lang w:val="fr-FR"/>
-        </w:rPr>
-        <w:t>realiter dis</w:t>
-      </w:r>
-      <w:r>
-        <w:rPr>
-          <w:lang w:val="fr-FR"/>
-        </w:rPr>
-        <w:t>tincte nominatim specialiter ac Certitudinaliter melioribus modis viis et mediis ac [eol]</w:t>
-      </w:r>
-    </w:p>
-    <w:p>
-      <w:pPr>
-        <w:ind w:left="720" w:right="-720" w:hanging="720"/>
-        <w:rPr>
-          <w:lang w:val="fr-FR"/>
-        </w:rPr>
-      </w:pPr>
-      <w:r>
-        <w:rPr>
-          <w:lang w:val="fr-FR"/>
-        </w:rPr>
-        <w:t xml:space="preserve">[line </w:t>
-      </w:r>
-      <w:r>
-        <w:rPr>
-          <w:lang w:val="fr-FR"/>
-        </w:rPr>
-        <w:t>50</w:t>
-      </w:r>
-      <w:r>
-        <w:rPr>
-          <w:lang w:val="fr-FR"/>
-        </w:rPr>
-        <w:t xml:space="preserve">] </w:t>
-      </w:r>
-      <w:r>
-        <w:rPr>
-          <w:lang w:val="fr-FR"/>
-        </w:rPr>
         <w:t>Clarioribus et efficacioribus terminis verbis atque sententiis</w:t>
       </w:r>
       <w:r>
@@ -3960,7 +4091,19 @@
         <w:rPr>
           <w:lang w:val="fr-FR"/>
         </w:rPr>
-        <w:t>maneria mesuag’ terr’ tenementa Reddit Reverciones et servic’ ac ceter’ heredit’ quicu’que [eol]</w:t>
+        <w:t>maneria mesuag’ terr’ tenementa Reddit Reverciones et servic’ ac ceter’ heredit’ qu</w:t>
+      </w:r>
+      <w:r>
+        <w:rPr>
+          <w:lang w:val="fr-FR"/>
+        </w:rPr>
+        <w:t>e</w:t>
+      </w:r>
+      <w:r>
+        <w:rPr>
+          <w:lang w:val="fr-FR"/>
+        </w:rPr>
+        <w:t>cu’que [eol]</w:t>
       </w:r>
     </w:p>
     <w:p>
@@ -4103,152 +4246,152 @@
         <w:rPr>
           <w:rStyle w:val="FootnoteReference"/>
         </w:rPr>
+        <w:footnoteReference w:id="3"/>
+      </w:r>
+      <w:r>
+        <w:rPr>
+          <w:lang w:val="pt-BR"/>
+        </w:rPr>
+        <w:t xml:space="preserve"> præmissorum</w:t>
+      </w:r>
+      <w:r>
+        <w:rPr>
+          <w:lang w:val="pt-BR"/>
+        </w:rPr>
+        <w:t xml:space="preserve"> </w:t>
+      </w:r>
+      <w:r>
+        <w:rPr>
+          <w:lang w:val="pt-BR"/>
+        </w:rPr>
+        <w:t xml:space="preserve">aut </w:t>
+      </w:r>
+      <w:r>
+        <w:rPr>
+          <w:highlight w:val="yellow"/>
+          <w:lang w:val="pt-BR"/>
+        </w:rPr>
+        <w:t>???</w:t>
+      </w:r>
+      <w:r>
+        <w:rPr>
+          <w:lang w:val="pt-BR"/>
+        </w:rPr>
+        <w:t xml:space="preserve"> aliis donis sive concessionibus per nos vel per aliquid progenitorum nostrorum </w:t>
+      </w:r>
+      <w:r>
+        <w:rPr>
+          <w:lang w:val="pt-BR"/>
+        </w:rPr>
+        <w:t xml:space="preserve">prefato Episcopo Meneven’ aut </w:t>
+      </w:r>
+      <w:r>
+        <w:rPr>
+          <w:lang w:val="pt-BR"/>
+        </w:rPr>
+        <w:t>alicui predecessor’ suor’ ant</w:t>
+      </w:r>
+      <w:r>
+        <w:rPr>
+          <w:lang w:val="pt-BR"/>
+        </w:rPr>
+        <w:t xml:space="preserve">e </w:t>
+      </w:r>
+      <w:r>
+        <w:rPr>
+          <w:lang w:val="pt-BR"/>
+        </w:rPr>
+        <w:t>[</w:t>
+      </w:r>
+      <w:r>
+        <w:rPr>
+          <w:highlight w:val="yellow"/>
+          <w:lang w:val="pt-BR"/>
+        </w:rPr>
+        <w:t xml:space="preserve">fold </w:t>
+      </w:r>
+      <w:r>
+        <w:rPr>
+          <w:lang w:val="pt-BR"/>
+        </w:rPr>
+        <w:t>: following somewhat conjectural</w:t>
+      </w:r>
+      <w:r>
+        <w:rPr>
+          <w:lang w:val="pt-BR"/>
+        </w:rPr>
+        <w:t xml:space="preserve">] hec tempor’ fca in ??tibus minim’ </w:t>
+      </w:r>
+      <w:r>
+        <w:rPr>
+          <w:lang w:val="pt-BR"/>
+        </w:rPr>
+        <w:t>fact’ exist</w:t>
+      </w:r>
+      <w:r>
+        <w:rPr>
+          <w:lang w:val="pt-BR"/>
+        </w:rPr>
+        <w:t>o</w:t>
+      </w:r>
+      <w:r>
+        <w:rPr>
+          <w:lang w:val="pt-BR"/>
+        </w:rPr>
+        <w:t xml:space="preserve"> Aut </w:t>
+      </w:r>
+      <w:r>
+        <w:rPr>
+          <w:lang w:val="pt-BR"/>
+        </w:rPr>
+        <w:t>Aliquo</w:t>
+      </w:r>
+      <w:r>
+        <w:rPr>
+          <w:lang w:val="pt-BR"/>
+        </w:rPr>
+        <w:t xml:space="preserve"> [eol]</w:t>
+      </w:r>
+    </w:p>
+    <w:p>
+      <w:pPr>
+        <w:ind w:left="720" w:right="-720" w:hanging="720"/>
+      </w:pPr>
+      <w:r>
+        <w:rPr>
+          <w:lang w:val="pt-BR"/>
+        </w:rPr>
+        <w:t xml:space="preserve">[line </w:t>
+      </w:r>
+      <w:r>
+        <w:rPr>
+          <w:lang w:val="pt-BR"/>
+        </w:rPr>
+        <w:t>5</w:t>
+      </w:r>
+      <w:r>
+        <w:rPr>
+          <w:lang w:val="pt-BR"/>
+        </w:rPr>
+        <w:t>3</w:t>
+      </w:r>
+      <w:r>
+        <w:rPr>
+          <w:lang w:val="pt-BR"/>
+        </w:rPr>
+        <w:t xml:space="preserve">] </w:t>
+      </w:r>
+      <w:r>
+        <w:rPr>
+          <w:lang w:val="pt-BR"/>
+        </w:rPr>
+        <w:t>[illegible…] ordinatione provisione sive</w:t>
+      </w:r>
+      <w:r>
+        <w:rPr>
+          <w:rStyle w:val="FootnoteReference"/>
+        </w:rPr>
         <w:footnoteReference w:id="4"/>
-      </w:r>
-      <w:r>
-        <w:rPr>
-          <w:lang w:val="pt-BR"/>
-        </w:rPr>
-        <w:t xml:space="preserve"> præmissorum</w:t>
-      </w:r>
-      <w:r>
-        <w:rPr>
-          <w:lang w:val="pt-BR"/>
-        </w:rPr>
-        <w:t xml:space="preserve"> </w:t>
-      </w:r>
-      <w:r>
-        <w:rPr>
-          <w:lang w:val="pt-BR"/>
-        </w:rPr>
-        <w:t xml:space="preserve">aut </w:t>
-      </w:r>
-      <w:r>
-        <w:rPr>
-          <w:highlight w:val="yellow"/>
-          <w:lang w:val="pt-BR"/>
-        </w:rPr>
-        <w:t>???</w:t>
-      </w:r>
-      <w:r>
-        <w:rPr>
-          <w:lang w:val="pt-BR"/>
-        </w:rPr>
-        <w:t xml:space="preserve"> aliis donis sive concessionibus per nos vel per aliquid progenitorum nostrorum </w:t>
-      </w:r>
-      <w:r>
-        <w:rPr>
-          <w:lang w:val="pt-BR"/>
-        </w:rPr>
-        <w:t xml:space="preserve">prefato Episcopo Meneven’ aut </w:t>
-      </w:r>
-      <w:r>
-        <w:rPr>
-          <w:lang w:val="pt-BR"/>
-        </w:rPr>
-        <w:t>alicui predecessor’ suor’ ant</w:t>
-      </w:r>
-      <w:r>
-        <w:rPr>
-          <w:lang w:val="pt-BR"/>
-        </w:rPr>
-        <w:t xml:space="preserve">e </w:t>
-      </w:r>
-      <w:r>
-        <w:rPr>
-          <w:lang w:val="pt-BR"/>
-        </w:rPr>
-        <w:t>[</w:t>
-      </w:r>
-      <w:r>
-        <w:rPr>
-          <w:highlight w:val="yellow"/>
-          <w:lang w:val="pt-BR"/>
-        </w:rPr>
-        <w:t xml:space="preserve">fold </w:t>
-      </w:r>
-      <w:r>
-        <w:rPr>
-          <w:lang w:val="pt-BR"/>
-        </w:rPr>
-        <w:t>: following somewhat conjectural</w:t>
-      </w:r>
-      <w:r>
-        <w:rPr>
-          <w:lang w:val="pt-BR"/>
-        </w:rPr>
-        <w:t xml:space="preserve">] hec tempor’ fca in ??tibus minim’ </w:t>
-      </w:r>
-      <w:r>
-        <w:rPr>
-          <w:lang w:val="pt-BR"/>
-        </w:rPr>
-        <w:t>fact’ exist</w:t>
-      </w:r>
-      <w:r>
-        <w:rPr>
-          <w:lang w:val="pt-BR"/>
-        </w:rPr>
-        <w:t>o</w:t>
-      </w:r>
-      <w:r>
-        <w:rPr>
-          <w:lang w:val="pt-BR"/>
-        </w:rPr>
-        <w:t xml:space="preserve"> Aut </w:t>
-      </w:r>
-      <w:r>
-        <w:rPr>
-          <w:lang w:val="pt-BR"/>
-        </w:rPr>
-        <w:t>Aliquo</w:t>
-      </w:r>
-      <w:r>
-        <w:rPr>
-          <w:lang w:val="pt-BR"/>
-        </w:rPr>
-        <w:t xml:space="preserve"> [eol]</w:t>
-      </w:r>
-    </w:p>
-    <w:p>
-      <w:pPr>
-        <w:ind w:left="720" w:right="-720" w:hanging="720"/>
-      </w:pPr>
-      <w:r>
-        <w:rPr>
-          <w:lang w:val="pt-BR"/>
-        </w:rPr>
-        <w:t xml:space="preserve">[line </w:t>
-      </w:r>
-      <w:r>
-        <w:rPr>
-          <w:lang w:val="pt-BR"/>
-        </w:rPr>
-        <w:t>5</w:t>
-      </w:r>
-      <w:r>
-        <w:rPr>
-          <w:lang w:val="pt-BR"/>
-        </w:rPr>
-        <w:t>3</w:t>
-      </w:r>
-      <w:r>
-        <w:rPr>
-          <w:lang w:val="pt-BR"/>
-        </w:rPr>
-        <w:t xml:space="preserve">] </w:t>
-      </w:r>
-      <w:r>
-        <w:rPr>
-          <w:lang w:val="pt-BR"/>
-        </w:rPr>
-        <w:t>[illegible…] ordinatione provisione sive</w:t>
-      </w:r>
-      <w:r>
-        <w:rPr>
-          <w:rStyle w:val="FootnoteReference"/>
-        </w:rPr>
-        <w:footnoteReference w:id="5"/>
       </w:r>
       <w:r>
         <w:rPr>
@@ -4497,7 +4640,17 @@
         <w:footnoteRef/>
       </w:r>
       <w:r>
-        <w:t xml:space="preserve"> Debuit: sic; R clearly gives debuerunt</w:t>
+        <w:t xml:space="preserve"> Def confirmavimus: in my transcript of R on the site (with images) I have confirmamus, which is </w:t>
+      </w:r>
+      <w:r>
+        <w:rPr>
+          <w:b/>
+          <w:bCs/>
+        </w:rPr>
+        <w:t>incorrect</w:t>
+      </w:r>
+      <w:r>
+        <w:t>: in image of R it def shows confirmavimus as well: fix that webpage and also the xml here as necessary!</w:t>
       </w:r>
     </w:p>
   </w:footnote>
@@ -4513,43 +4666,17 @@
         <w:footnoteRef/>
       </w:r>
       <w:r>
-        <w:t xml:space="preserve"> Def confirmavimus: in my transcript of R on the site (with images) I have confirmamus, which is </w:t>
-      </w:r>
-      <w:r>
-        <w:rPr>
-          <w:b/>
-          <w:bCs/>
-        </w:rPr>
-        <w:t>incorrect</w:t>
-      </w:r>
-      <w:r>
-        <w:t>: in image of R it def shows confirmavimus as well: fix that webpage and also the xml here as necessary!</w:t>
+        <w:t xml:space="preserve"> Nb missing words “</w:t>
+      </w:r>
+      <w:r>
+        <w:t>aut valore</w:t>
+      </w:r>
+      <w:r>
+        <w:t>” found here in other witnesses</w:t>
       </w:r>
     </w:p>
   </w:footnote>
   <w:footnote w:id="4">
-    <w:p>
-      <w:pPr>
-        <w:pStyle w:val="FootnoteText"/>
-      </w:pPr>
-      <w:r>
-        <w:rPr>
-          <w:rStyle w:val="FootnoteReference"/>
-        </w:rPr>
-        <w:footnoteRef/>
-      </w:r>
-      <w:r>
-        <w:t xml:space="preserve"> Nb missing words “</w:t>
-      </w:r>
-      <w:r>
-        <w:t>aut valore</w:t>
-      </w:r>
-      <w:r>
-        <w:t>” found here in other witnesses</w:t>
-      </w:r>
-    </w:p>
-  </w:footnote>
-  <w:footnote w:id="5">
     <w:p>
       <w:pPr>
         <w:pStyle w:val="FootnoteText"/>

</xml_diff>

<commit_message>
checking R against XML and palaeography-view pages
</commit_message>
<xml_diff>
--- a/C82Brecon.docx
+++ b/C82Brecon.docx
@@ -2712,6 +2712,12 @@
         <w:rPr>
           <w:lang w:val="fr-FR"/>
         </w:rPr>
+        <w:t xml:space="preserve">[ab 15] </w:t>
+      </w:r>
+      <w:r>
+        <w:rPr>
+          <w:lang w:val="fr-FR"/>
+        </w:rPr>
         <w:t>Ac eciam de gracia nostra</w:t>
       </w:r>
       <w:r>
@@ -3870,18 +3876,375 @@
         <w:rPr>
           <w:lang w:val="fr-FR"/>
         </w:rPr>
-        <w:t>vimus</w:t>
-      </w:r>
-      <w:r>
-        <w:rPr>
-          <w:rStyle w:val="FootnoteReference"/>
-          <w:lang w:val="fr-FR"/>
-        </w:rPr>
-        <w:footnoteReference w:id="2"/>
-      </w:r>
-      <w:r>
-        <w:rPr>
-          <w:lang w:val="fr-FR"/>
+        <w:t>vimus [eol]</w:t>
+      </w:r>
+    </w:p>
+    <w:p>
+      <w:pPr>
+        <w:ind w:left="720" w:right="-720" w:hanging="720"/>
+        <w:rPr>
+          <w:lang w:val="fr-FR"/>
+        </w:rPr>
+      </w:pPr>
+      <w:r>
+        <w:rPr>
+          <w:lang w:val="fr-FR"/>
+        </w:rPr>
+        <w:t>[line 4</w:t>
+      </w:r>
+      <w:r>
+        <w:rPr>
+          <w:lang w:val="fr-FR"/>
+        </w:rPr>
+        <w:t>9</w:t>
+      </w:r>
+      <w:r>
+        <w:rPr>
+          <w:lang w:val="fr-FR"/>
+        </w:rPr>
+        <w:t xml:space="preserve">] </w:t>
+      </w:r>
+      <w:r>
+        <w:rPr>
+          <w:lang w:val="fr-FR"/>
+        </w:rPr>
+        <w:t>per presentes dicto nunc Episcopo Meneven' et successor’ suis tam libere et effectualiter</w:t>
+      </w:r>
+      <w:r>
+        <w:rPr>
+          <w:lang w:val="fr-FR"/>
+        </w:rPr>
+        <w:t xml:space="preserve"> bene sufficienter et integraliter Ac si omnia et </w:t>
+      </w:r>
+      <w:r>
+        <w:rPr>
+          <w:lang w:val="fr-FR"/>
+        </w:rPr>
+        <w:t>singula premiss’ cum suis pertinenc’ universis</w:t>
+      </w:r>
+      <w:r>
+        <w:rPr>
+          <w:lang w:val="fr-FR"/>
+        </w:rPr>
+        <w:t xml:space="preserve"> </w:t>
+      </w:r>
+      <w:r>
+        <w:rPr>
+          <w:lang w:val="fr-FR"/>
+        </w:rPr>
+        <w:t>realiter dis</w:t>
+      </w:r>
+      <w:r>
+        <w:rPr>
+          <w:lang w:val="fr-FR"/>
+        </w:rPr>
+        <w:t>tincte nominatim specialiter ac Certitudinaliter melioribus modis viis et mediis ac [eol]</w:t>
+      </w:r>
+    </w:p>
+    <w:p>
+      <w:pPr>
+        <w:ind w:left="720" w:right="-720" w:hanging="720"/>
+        <w:rPr>
+          <w:lang w:val="fr-FR"/>
+        </w:rPr>
+      </w:pPr>
+      <w:r>
+        <w:rPr>
+          <w:lang w:val="fr-FR"/>
+        </w:rPr>
+        <w:t xml:space="preserve">[line </w:t>
+      </w:r>
+      <w:r>
+        <w:rPr>
+          <w:lang w:val="fr-FR"/>
+        </w:rPr>
+        <w:t>50</w:t>
+      </w:r>
+      <w:r>
+        <w:rPr>
+          <w:lang w:val="fr-FR"/>
+        </w:rPr>
+        <w:t xml:space="preserve">] </w:t>
+      </w:r>
+      <w:r>
+        <w:rPr>
+          <w:lang w:val="fr-FR"/>
+        </w:rPr>
+        <w:t>Clarioribus et efficacioribus terminis verbis atque sententiis</w:t>
+      </w:r>
+      <w:r>
+        <w:rPr>
+          <w:lang w:val="fr-FR"/>
+        </w:rPr>
+        <w:t xml:space="preserve"> i</w:t>
+      </w:r>
+      <w:r>
+        <w:rPr>
+          <w:lang w:val="fr-FR"/>
+        </w:rPr>
+        <w:t>uxta omnem juris effectum</w:t>
+      </w:r>
+      <w:r>
+        <w:rPr>
+          <w:lang w:val="fr-FR"/>
+        </w:rPr>
+        <w:t xml:space="preserve"> et iuxta </w:t>
+      </w:r>
+      <w:r>
+        <w:rPr>
+          <w:lang w:val="fr-FR"/>
+        </w:rPr>
+        <w:t xml:space="preserve">omnes melior’ et maxime sufficientes intelligencias in lege dict’ </w:t>
+      </w:r>
+      <w:r>
+        <w:rPr>
+          <w:lang w:val="fr-FR"/>
+        </w:rPr>
+        <w:t xml:space="preserve">nuper priorat’ colleg’ </w:t>
+      </w:r>
+      <w:r>
+        <w:rPr>
+          <w:lang w:val="fr-FR"/>
+        </w:rPr>
+        <w:t>maneria mesuag’ terr’ tenementa Reddit Reverciones et servic’ ac ceter’ heredit’ qu</w:t>
+      </w:r>
+      <w:r>
+        <w:rPr>
+          <w:lang w:val="fr-FR"/>
+        </w:rPr>
+        <w:t>e</w:t>
+      </w:r>
+      <w:r>
+        <w:rPr>
+          <w:lang w:val="fr-FR"/>
+        </w:rPr>
+        <w:t>cu’que [eol]</w:t>
+      </w:r>
+    </w:p>
+    <w:p>
+      <w:pPr>
+        <w:ind w:left="720" w:right="-720" w:hanging="720"/>
+        <w:rPr>
+          <w:lang w:val="fr-FR"/>
+        </w:rPr>
+      </w:pPr>
+      <w:r>
+        <w:rPr>
+          <w:lang w:val="fr-FR"/>
+        </w:rPr>
+        <w:t>[line 5</w:t>
+      </w:r>
+      <w:r>
+        <w:rPr>
+          <w:lang w:val="fr-FR"/>
+        </w:rPr>
+        <w:t>1</w:t>
+      </w:r>
+      <w:r>
+        <w:rPr>
+          <w:lang w:val="fr-FR"/>
+        </w:rPr>
+        <w:t xml:space="preserve">] </w:t>
+      </w:r>
+      <w:r>
+        <w:rPr>
+          <w:lang w:val="fr-FR"/>
+        </w:rPr>
+        <w:t xml:space="preserve">cum omnibus et singulis suis pertinentiis et commoditatibus universis </w:t>
+      </w:r>
+      <w:r>
+        <w:rPr>
+          <w:lang w:val="fr-FR"/>
+        </w:rPr>
+        <w:t>declarat dat’ explanat’ pronuciat’ et</w:t>
+      </w:r>
+      <w:r>
+        <w:rPr>
+          <w:lang w:val="fr-FR"/>
+        </w:rPr>
+        <w:t xml:space="preserve"> puplicat’ fuissent et essent aptissim</w:t>
+      </w:r>
+      <w:r>
+        <w:rPr>
+          <w:lang w:val="fr-FR"/>
+        </w:rPr>
+        <w:t>is</w:t>
+      </w:r>
+      <w:r>
+        <w:rPr>
+          <w:lang w:val="fr-FR"/>
+        </w:rPr>
+        <w:t xml:space="preserve"> </w:t>
+      </w:r>
+      <w:r>
+        <w:rPr>
+          <w:lang w:val="fr-FR"/>
+        </w:rPr>
+        <w:t xml:space="preserve">Verbis atque sentenciis in Lege ad </w:t>
+      </w:r>
+      <w:r>
+        <w:rPr>
+          <w:lang w:val="fr-FR"/>
+        </w:rPr>
+        <w:t xml:space="preserve">premiss’ et quamlibet </w:t>
+      </w:r>
+      <w:r>
+        <w:rPr>
+          <w:lang w:val="fr-FR"/>
+        </w:rPr>
+        <w:t>inde parcell’ clarissimam accomodatissimam et specialissimam que possunt excogita-[eol]</w:t>
+      </w:r>
+    </w:p>
+    <w:p>
+      <w:pPr>
+        <w:ind w:left="720" w:right="-720" w:hanging="720"/>
+        <w:rPr>
+          <w:lang w:val="pt-BR"/>
+        </w:rPr>
+      </w:pPr>
+      <w:r>
+        <w:rPr>
+          <w:lang w:val="pt-BR"/>
+        </w:rPr>
+        <w:t>[line 5</w:t>
+      </w:r>
+      <w:r>
+        <w:rPr>
+          <w:lang w:val="pt-BR"/>
+        </w:rPr>
+        <w:t>2</w:t>
+      </w:r>
+      <w:r>
+        <w:rPr>
+          <w:lang w:val="pt-BR"/>
+        </w:rPr>
+        <w:t xml:space="preserve">] </w:t>
+      </w:r>
+      <w:r>
+        <w:rPr>
+          <w:lang w:val="pt-BR"/>
+        </w:rPr>
+        <w:t>ri.</w:t>
+      </w:r>
+      <w:r>
+        <w:rPr>
+          <w:lang w:val="pt-BR"/>
+        </w:rPr>
+        <w:t xml:space="preserve"> </w:t>
+      </w:r>
+      <w:r>
+        <w:rPr>
+          <w:lang w:val="pt-BR"/>
+        </w:rPr>
+        <w:t>Eo quod expressa mentio de certitudine præmissorum</w:t>
+      </w:r>
+      <w:r>
+        <w:rPr>
+          <w:lang w:val="pt-BR"/>
+        </w:rPr>
+        <w:t xml:space="preserve"> </w:t>
+      </w:r>
+      <w:r>
+        <w:rPr>
+          <w:lang w:val="pt-BR"/>
+        </w:rPr>
+        <w:t xml:space="preserve">aut </w:t>
+      </w:r>
+      <w:r>
+        <w:rPr>
+          <w:highlight w:val="yellow"/>
+          <w:lang w:val="pt-BR"/>
+        </w:rPr>
+        <w:t>???</w:t>
+      </w:r>
+      <w:r>
+        <w:rPr>
+          <w:lang w:val="pt-BR"/>
+        </w:rPr>
+        <w:t xml:space="preserve"> aliis donis sive concessionibus per nos vel per aliqu</w:t>
+      </w:r>
+      <w:r>
+        <w:rPr>
+          <w:lang w:val="pt-BR"/>
+        </w:rPr>
+        <w:t>em</w:t>
+      </w:r>
+      <w:r>
+        <w:rPr>
+          <w:lang w:val="pt-BR"/>
+        </w:rPr>
+        <w:t xml:space="preserve"> progenitorum nostrorum </w:t>
+      </w:r>
+      <w:r>
+        <w:rPr>
+          <w:lang w:val="pt-BR"/>
+        </w:rPr>
+        <w:t xml:space="preserve">prefato Episcopo Meneven’ aut </w:t>
+      </w:r>
+      <w:r>
+        <w:rPr>
+          <w:lang w:val="pt-BR"/>
+        </w:rPr>
+        <w:t>alicui predecessor’ suor’ ant</w:t>
+      </w:r>
+      <w:r>
+        <w:rPr>
+          <w:lang w:val="pt-BR"/>
+        </w:rPr>
+        <w:t xml:space="preserve">e </w:t>
+      </w:r>
+      <w:r>
+        <w:rPr>
+          <w:lang w:val="pt-BR"/>
+        </w:rPr>
+        <w:t>[</w:t>
+      </w:r>
+      <w:r>
+        <w:rPr>
+          <w:highlight w:val="yellow"/>
+          <w:lang w:val="pt-BR"/>
+        </w:rPr>
+        <w:t xml:space="preserve">fold </w:t>
+      </w:r>
+      <w:r>
+        <w:rPr>
+          <w:lang w:val="pt-BR"/>
+        </w:rPr>
+        <w:t>: following somewhat conjectural</w:t>
+      </w:r>
+      <w:r>
+        <w:rPr>
+          <w:lang w:val="pt-BR"/>
+        </w:rPr>
+        <w:t xml:space="preserve">] hec tempor’ fca in ??tibus minim’ </w:t>
+      </w:r>
+      <w:r>
+        <w:rPr>
+          <w:lang w:val="pt-BR"/>
+        </w:rPr>
+        <w:t>fact’ exist</w:t>
+      </w:r>
+      <w:r>
+        <w:rPr>
+          <w:lang w:val="pt-BR"/>
+        </w:rPr>
+        <w:t>o</w:t>
+      </w:r>
+      <w:r>
+        <w:rPr>
+          <w:lang w:val="pt-BR"/>
+        </w:rPr>
+        <w:t xml:space="preserve"> Aut </w:t>
+      </w:r>
+      <w:r>
+        <w:rPr>
+          <w:lang w:val="pt-BR"/>
+        </w:rPr>
+        <w:t>Aliquo</w:t>
+      </w:r>
+      <w:r>
+        <w:rPr>
+          <w:lang w:val="pt-BR"/>
         </w:rPr>
         <w:t xml:space="preserve"> [eol]</w:t>
       </w:r>
@@ -3889,225 +4252,6 @@
     <w:p>
       <w:pPr>
         <w:ind w:left="720" w:right="-720" w:hanging="720"/>
-        <w:rPr>
-          <w:lang w:val="fr-FR"/>
-        </w:rPr>
-      </w:pPr>
-      <w:r>
-        <w:rPr>
-          <w:lang w:val="fr-FR"/>
-        </w:rPr>
-        <w:t>[line 4</w:t>
-      </w:r>
-      <w:r>
-        <w:rPr>
-          <w:lang w:val="fr-FR"/>
-        </w:rPr>
-        <w:t>9</w:t>
-      </w:r>
-      <w:r>
-        <w:rPr>
-          <w:lang w:val="fr-FR"/>
-        </w:rPr>
-        <w:t xml:space="preserve">] </w:t>
-      </w:r>
-      <w:r>
-        <w:rPr>
-          <w:lang w:val="fr-FR"/>
-        </w:rPr>
-        <w:t>per presentes dicto nunc Episcopo Meneven' et successor’ suis tam libere et effectualiter</w:t>
-      </w:r>
-      <w:r>
-        <w:rPr>
-          <w:lang w:val="fr-FR"/>
-        </w:rPr>
-        <w:t xml:space="preserve"> bene sufficienter et integraliter Ac si omnia et </w:t>
-      </w:r>
-      <w:r>
-        <w:rPr>
-          <w:lang w:val="fr-FR"/>
-        </w:rPr>
-        <w:t>singula premiss’ cum suis pertinenc’ universis</w:t>
-      </w:r>
-      <w:r>
-        <w:rPr>
-          <w:lang w:val="fr-FR"/>
-        </w:rPr>
-        <w:t xml:space="preserve"> </w:t>
-      </w:r>
-      <w:r>
-        <w:rPr>
-          <w:lang w:val="fr-FR"/>
-        </w:rPr>
-        <w:t>realiter dis</w:t>
-      </w:r>
-      <w:r>
-        <w:rPr>
-          <w:lang w:val="fr-FR"/>
-        </w:rPr>
-        <w:t>tincte nominatim specialiter ac Certitudinaliter melioribus modis viis et mediis ac [eol]</w:t>
-      </w:r>
-    </w:p>
-    <w:p>
-      <w:pPr>
-        <w:ind w:left="720" w:right="-720" w:hanging="720"/>
-        <w:rPr>
-          <w:lang w:val="fr-FR"/>
-        </w:rPr>
-      </w:pPr>
-      <w:r>
-        <w:rPr>
-          <w:lang w:val="fr-FR"/>
-        </w:rPr>
-        <w:t xml:space="preserve">[line </w:t>
-      </w:r>
-      <w:r>
-        <w:rPr>
-          <w:lang w:val="fr-FR"/>
-        </w:rPr>
-        <w:t>50</w:t>
-      </w:r>
-      <w:r>
-        <w:rPr>
-          <w:lang w:val="fr-FR"/>
-        </w:rPr>
-        <w:t xml:space="preserve">] </w:t>
-      </w:r>
-      <w:r>
-        <w:rPr>
-          <w:lang w:val="fr-FR"/>
-        </w:rPr>
-        <w:t>Clarioribus et efficacioribus terminis verbis atque sententiis</w:t>
-      </w:r>
-      <w:r>
-        <w:rPr>
-          <w:lang w:val="fr-FR"/>
-        </w:rPr>
-        <w:t xml:space="preserve"> i</w:t>
-      </w:r>
-      <w:r>
-        <w:rPr>
-          <w:lang w:val="fr-FR"/>
-        </w:rPr>
-        <w:t>uxta omnem juris effectum</w:t>
-      </w:r>
-      <w:r>
-        <w:rPr>
-          <w:lang w:val="fr-FR"/>
-        </w:rPr>
-        <w:t xml:space="preserve"> et iuxta </w:t>
-      </w:r>
-      <w:r>
-        <w:rPr>
-          <w:lang w:val="fr-FR"/>
-        </w:rPr>
-        <w:t xml:space="preserve">omnes melior’ et maxime sufficientes intelligencias in lege dict’ </w:t>
-      </w:r>
-      <w:r>
-        <w:rPr>
-          <w:lang w:val="fr-FR"/>
-        </w:rPr>
-        <w:t xml:space="preserve">nuper priorat’ colleg’ </w:t>
-      </w:r>
-      <w:r>
-        <w:rPr>
-          <w:lang w:val="fr-FR"/>
-        </w:rPr>
-        <w:t>maneria mesuag’ terr’ tenementa Reddit Reverciones et servic’ ac ceter’ heredit’ qu</w:t>
-      </w:r>
-      <w:r>
-        <w:rPr>
-          <w:lang w:val="fr-FR"/>
-        </w:rPr>
-        <w:t>e</w:t>
-      </w:r>
-      <w:r>
-        <w:rPr>
-          <w:lang w:val="fr-FR"/>
-        </w:rPr>
-        <w:t>cu’que [eol]</w:t>
-      </w:r>
-    </w:p>
-    <w:p>
-      <w:pPr>
-        <w:ind w:left="720" w:right="-720" w:hanging="720"/>
-        <w:rPr>
-          <w:lang w:val="fr-FR"/>
-        </w:rPr>
-      </w:pPr>
-      <w:r>
-        <w:rPr>
-          <w:lang w:val="fr-FR"/>
-        </w:rPr>
-        <w:t>[line 5</w:t>
-      </w:r>
-      <w:r>
-        <w:rPr>
-          <w:lang w:val="fr-FR"/>
-        </w:rPr>
-        <w:t>1</w:t>
-      </w:r>
-      <w:r>
-        <w:rPr>
-          <w:lang w:val="fr-FR"/>
-        </w:rPr>
-        <w:t xml:space="preserve">] </w:t>
-      </w:r>
-      <w:r>
-        <w:rPr>
-          <w:lang w:val="fr-FR"/>
-        </w:rPr>
-        <w:t xml:space="preserve">cum omnibus et singulis suis pertinentiis et commoditatibus universis </w:t>
-      </w:r>
-      <w:r>
-        <w:rPr>
-          <w:lang w:val="fr-FR"/>
-        </w:rPr>
-        <w:t>declarat dat’ explanat’ pronuciat’ et</w:t>
-      </w:r>
-      <w:r>
-        <w:rPr>
-          <w:lang w:val="fr-FR"/>
-        </w:rPr>
-        <w:t xml:space="preserve"> puplicat’ fuissent et essent aptissim</w:t>
-      </w:r>
-      <w:r>
-        <w:rPr>
-          <w:lang w:val="fr-FR"/>
-        </w:rPr>
-        <w:t>is</w:t>
-      </w:r>
-      <w:r>
-        <w:rPr>
-          <w:lang w:val="fr-FR"/>
-        </w:rPr>
-        <w:t xml:space="preserve"> </w:t>
-      </w:r>
-      <w:r>
-        <w:rPr>
-          <w:lang w:val="fr-FR"/>
-        </w:rPr>
-        <w:t xml:space="preserve">Verbis atque sentenciis in Lege ad </w:t>
-      </w:r>
-      <w:r>
-        <w:rPr>
-          <w:lang w:val="fr-FR"/>
-        </w:rPr>
-        <w:t xml:space="preserve">premiss’ et quamlibet </w:t>
-      </w:r>
-      <w:r>
-        <w:rPr>
-          <w:lang w:val="fr-FR"/>
-        </w:rPr>
-        <w:t>inde parcell’ clarissimam accomodatissimam et specialissimam que possunt excogita-[eol]</w:t>
-      </w:r>
-    </w:p>
-    <w:p>
-      <w:pPr>
-        <w:ind w:left="720" w:right="-720" w:hanging="720"/>
-        <w:rPr>
-          <w:lang w:val="pt-BR"/>
-        </w:rPr>
       </w:pPr>
       <w:r>
         <w:rPr>
@@ -4120,7 +4264,7 @@
         <w:rPr>
           <w:lang w:val="pt-BR"/>
         </w:rPr>
-        <w:t>2</w:t>
+        <w:t>3</w:t>
       </w:r>
       <w:r>
         <w:rPr>
@@ -4132,164 +4276,13 @@
         <w:rPr>
           <w:lang w:val="pt-BR"/>
         </w:rPr>
-        <w:t>ri.</w:t>
-      </w:r>
-      <w:r>
-        <w:rPr>
-          <w:lang w:val="pt-BR"/>
-        </w:rPr>
-        <w:t xml:space="preserve"> </w:t>
-      </w:r>
-      <w:r>
-        <w:rPr>
-          <w:lang w:val="pt-BR"/>
-        </w:rPr>
-        <w:t>Eo quod expressa mentio de certitudine præmissorum</w:t>
-      </w:r>
-      <w:r>
-        <w:rPr>
-          <w:lang w:val="pt-BR"/>
-        </w:rPr>
-        <w:t xml:space="preserve"> </w:t>
-      </w:r>
-      <w:r>
-        <w:rPr>
-          <w:lang w:val="pt-BR"/>
-        </w:rPr>
-        <w:t xml:space="preserve">aut </w:t>
-      </w:r>
-      <w:r>
-        <w:rPr>
-          <w:highlight w:val="yellow"/>
-          <w:lang w:val="pt-BR"/>
-        </w:rPr>
-        <w:t>???</w:t>
-      </w:r>
-      <w:r>
-        <w:rPr>
-          <w:lang w:val="pt-BR"/>
-        </w:rPr>
-        <w:t xml:space="preserve"> aliis donis sive concessionibus per nos vel per aliqu</w:t>
-      </w:r>
-      <w:r>
-        <w:rPr>
-          <w:lang w:val="pt-BR"/>
-        </w:rPr>
-        <w:t>em</w:t>
-      </w:r>
-      <w:r>
-        <w:rPr>
-          <w:lang w:val="pt-BR"/>
-        </w:rPr>
-        <w:t xml:space="preserve"> progenitorum nostrorum </w:t>
-      </w:r>
-      <w:r>
-        <w:rPr>
-          <w:lang w:val="pt-BR"/>
-        </w:rPr>
-        <w:t xml:space="preserve">prefato Episcopo Meneven’ aut </w:t>
-      </w:r>
-      <w:r>
-        <w:rPr>
-          <w:lang w:val="pt-BR"/>
-        </w:rPr>
-        <w:t>alicui predecessor’ suor’ ant</w:t>
-      </w:r>
-      <w:r>
-        <w:rPr>
-          <w:lang w:val="pt-BR"/>
-        </w:rPr>
-        <w:t xml:space="preserve">e </w:t>
-      </w:r>
-      <w:r>
-        <w:rPr>
-          <w:lang w:val="pt-BR"/>
-        </w:rPr>
-        <w:t>[</w:t>
-      </w:r>
-      <w:r>
-        <w:rPr>
-          <w:highlight w:val="yellow"/>
-          <w:lang w:val="pt-BR"/>
-        </w:rPr>
-        <w:t xml:space="preserve">fold </w:t>
-      </w:r>
-      <w:r>
-        <w:rPr>
-          <w:lang w:val="pt-BR"/>
-        </w:rPr>
-        <w:t>: following somewhat conjectural</w:t>
-      </w:r>
-      <w:r>
-        <w:rPr>
-          <w:lang w:val="pt-BR"/>
-        </w:rPr>
-        <w:t xml:space="preserve">] hec tempor’ fca in ??tibus minim’ </w:t>
-      </w:r>
-      <w:r>
-        <w:rPr>
-          <w:lang w:val="pt-BR"/>
-        </w:rPr>
-        <w:t>fact’ exist</w:t>
-      </w:r>
-      <w:r>
-        <w:rPr>
-          <w:lang w:val="pt-BR"/>
-        </w:rPr>
-        <w:t>o</w:t>
-      </w:r>
-      <w:r>
-        <w:rPr>
-          <w:lang w:val="pt-BR"/>
-        </w:rPr>
-        <w:t xml:space="preserve"> Aut </w:t>
-      </w:r>
-      <w:r>
-        <w:rPr>
-          <w:lang w:val="pt-BR"/>
-        </w:rPr>
-        <w:t>Aliquo</w:t>
-      </w:r>
-      <w:r>
-        <w:rPr>
-          <w:lang w:val="pt-BR"/>
-        </w:rPr>
-        <w:t xml:space="preserve"> [eol]</w:t>
-      </w:r>
-    </w:p>
-    <w:p>
-      <w:pPr>
-        <w:ind w:left="720" w:right="-720" w:hanging="720"/>
-      </w:pPr>
-      <w:r>
-        <w:rPr>
-          <w:lang w:val="pt-BR"/>
-        </w:rPr>
-        <w:t>[line 5</w:t>
-      </w:r>
-      <w:r>
-        <w:rPr>
-          <w:lang w:val="pt-BR"/>
-        </w:rPr>
-        <w:t>3</w:t>
-      </w:r>
-      <w:r>
-        <w:rPr>
-          <w:lang w:val="pt-BR"/>
-        </w:rPr>
-        <w:t xml:space="preserve">] </w:t>
-      </w:r>
-      <w:r>
-        <w:rPr>
-          <w:lang w:val="pt-BR"/>
-        </w:rPr>
         <w:t>[illegible…] ordinatione provisione sive</w:t>
       </w:r>
       <w:r>
         <w:rPr>
           <w:rStyle w:val="FootnoteReference"/>
         </w:rPr>
-        <w:footnoteReference w:id="3"/>
+        <w:footnoteReference w:id="2"/>
       </w:r>
       <w:r>
         <w:rPr>
@@ -4566,32 +4559,6 @@
     </w:p>
   </w:footnote>
   <w:footnote w:id="2">
-    <w:p>
-      <w:pPr>
-        <w:pStyle w:val="FootnoteText"/>
-      </w:pPr>
-      <w:r>
-        <w:rPr>
-          <w:rStyle w:val="FootnoteReference"/>
-        </w:rPr>
-        <w:footnoteRef/>
-      </w:r>
-      <w:r>
-        <w:t xml:space="preserve"> Def confirmavimus: in my transcript of R on the site (with images) I have confirmamus, which is </w:t>
-      </w:r>
-      <w:r>
-        <w:rPr>
-          <w:b/>
-          <w:bCs/>
-        </w:rPr>
-        <w:t>incorrect</w:t>
-      </w:r>
-      <w:r>
-        <w:t>: in image of R it def shows confirmavimus as well: fix that webpage and also the xml here as necessary!</w:t>
-      </w:r>
-    </w:p>
-  </w:footnote>
-  <w:footnote w:id="3">
     <w:p>
       <w:pPr>
         <w:pStyle w:val="FootnoteText"/>

</xml_diff>